<commit_message>
Descripción de los cambios
</commit_message>
<xml_diff>
--- a/docs/Paper_Daltonismo.docx
+++ b/docs/Paper_Daltonismo.docx
@@ -104,7 +104,10 @@
       </w:r>
       <w:proofErr w:type="spellEnd"/>
       <w:r>
-        <w:t>. El sistema se diseña bajo una arquitectura modular y escalable que permitirá incorporar futuras mejoras, incluyendo modelos basados en inteligencia artificial.</w:t>
+        <w:t>. El sistema se diseña bajo una arquitectura modular y escalable que permitirá incorporar futuras mejoras</w:t>
+      </w:r>
+      <w:r>
+        <w:t>.</w:t>
       </w:r>
     </w:p>
     <w:p/>
@@ -235,6 +238,7 @@
           <w:bCs/>
           <w:color w:val="1F3864"/>
         </w:rPr>
+        <w:lastRenderedPageBreak/>
         <w:t>2. Objetivos</w:t>
       </w:r>
     </w:p>
@@ -298,7 +302,16 @@
         <w:spacing w:before="40" w:after="40"/>
       </w:pPr>
       <w:r>
-        <w:t>Analizar y operar sobre los espacios de color RGB y HSV.</w:t>
+        <w:t xml:space="preserve">Analizar y operar sobre los espacios de color RGB y </w:t>
+      </w:r>
+      <w:r>
+        <w:rPr>
+          <w:highlight w:val="yellow"/>
+        </w:rPr>
+        <w:t>HSV</w:t>
+      </w:r>
+      <w:r>
+        <w:t>.</w:t>
       </w:r>
     </w:p>
     <w:p>
@@ -332,6 +345,14 @@
       </w:r>
       <w:proofErr w:type="spellEnd"/>
       <w:r>
+        <w:t xml:space="preserve">, </w:t>
+      </w:r>
+      <w:proofErr w:type="spellStart"/>
+      <w:r>
+        <w:t>Pillow</w:t>
+      </w:r>
+      <w:proofErr w:type="spellEnd"/>
+      <w:r>
         <w:t xml:space="preserve"> y </w:t>
       </w:r>
       <w:proofErr w:type="spellStart"/>
@@ -369,20 +390,6 @@
         <w:t>Diseñar una arquitectura modular y escalable que facilite el mantenimiento y extensión del sistema.</w:t>
       </w:r>
     </w:p>
-    <w:p>
-      <w:pPr>
-        <w:pStyle w:val="Prrafodelista"/>
-        <w:numPr>
-          <w:ilvl w:val="0"/>
-          <w:numId w:val="2"/>
-        </w:numPr>
-        <w:spacing w:before="40" w:after="40"/>
-      </w:pPr>
-      <w:r>
-        <w:t>Establecer una base técnica para la futura integración con modelos de inteligencia artificial.</w:t>
-      </w:r>
-    </w:p>
-    <w:p/>
     <w:p>
       <w:pPr>
         <w:pStyle w:val="Ttulo1"/>
@@ -560,36 +567,51 @@
         <w:jc w:val="both"/>
       </w:pPr>
       <w:r>
-        <w:t>Donde</w:t>
-      </w:r>
-      <w:r>
-        <w:t>:</w:t>
-      </w:r>
-    </w:p>
-    <w:p>
-      <w:pPr>
-        <w:spacing w:before="80" w:after="80" w:line="320" w:lineRule="auto"/>
-        <w:jc w:val="both"/>
-      </w:pPr>
-      <w:r>
-        <w:t xml:space="preserve">h es la altura en píxeles, </w:t>
-      </w:r>
-    </w:p>
-    <w:p>
-      <w:pPr>
-        <w:spacing w:before="80" w:after="80" w:line="320" w:lineRule="auto"/>
-        <w:jc w:val="both"/>
-      </w:pPr>
-      <w:r>
-        <w:t>w el ancho</w:t>
-      </w:r>
-    </w:p>
-    <w:p>
-      <w:pPr>
-        <w:spacing w:before="80" w:after="80" w:line="320" w:lineRule="auto"/>
-        <w:jc w:val="both"/>
-      </w:pPr>
-      <w:r>
+        <w:t>Donde:</w:t>
+      </w:r>
+    </w:p>
+    <w:p>
+      <w:pPr>
+        <w:spacing w:before="80" w:after="80" w:line="320" w:lineRule="auto"/>
+        <w:jc w:val="both"/>
+      </w:pPr>
+      <w:r>
+        <w:rPr>
+          <w:i/>
+          <w:iCs/>
+        </w:rPr>
+        <w:t>h</w:t>
+      </w:r>
+      <w:r>
+        <w:t xml:space="preserve"> es la altura en píxeles, </w:t>
+      </w:r>
+    </w:p>
+    <w:p>
+      <w:pPr>
+        <w:spacing w:before="80" w:after="80" w:line="320" w:lineRule="auto"/>
+        <w:jc w:val="both"/>
+      </w:pPr>
+      <w:r>
+        <w:rPr>
+          <w:i/>
+          <w:iCs/>
+        </w:rPr>
+        <w:t>w</w:t>
+      </w:r>
+      <w:r>
+        <w:t xml:space="preserve"> el ancho</w:t>
+      </w:r>
+    </w:p>
+    <w:p>
+      <w:pPr>
+        <w:spacing w:before="80" w:after="80" w:line="320" w:lineRule="auto"/>
+        <w:jc w:val="both"/>
+      </w:pPr>
+      <w:r>
+        <w:rPr>
+          <w:b/>
+          <w:bCs/>
+        </w:rPr>
         <w:t>3</w:t>
       </w:r>
       <w:r>
@@ -607,7 +629,6 @@
           <w:bCs/>
           <w:color w:val="2E5496"/>
         </w:rPr>
-        <w:lastRenderedPageBreak/>
         <w:t>3.2 Espacios de Color</w:t>
       </w:r>
     </w:p>
@@ -625,14 +646,7 @@
           <w:b/>
           <w:bCs/>
         </w:rPr>
-        <w:t>RGB</w:t>
-      </w:r>
-      <w:r>
-        <w:rPr>
-          <w:b/>
-          <w:bCs/>
-        </w:rPr>
-        <w:t>:</w:t>
+        <w:t>RGB:</w:t>
       </w:r>
     </w:p>
     <w:p>
@@ -651,7 +665,8 @@
         <w:jc w:val="center"/>
       </w:pPr>
       <w:r>
-        <w:t>(R, G, B).</w:t>
+        <w:lastRenderedPageBreak/>
+        <w:t>(R, G, B)</w:t>
       </w:r>
     </w:p>
     <w:p>
@@ -669,98 +684,6 @@
         <w:jc w:val="both"/>
       </w:pPr>
     </w:p>
-    <w:p>
-      <w:pPr>
-        <w:spacing w:before="80" w:after="80" w:line="320" w:lineRule="auto"/>
-        <w:jc w:val="both"/>
-        <w:rPr>
-          <w:b/>
-          <w:bCs/>
-        </w:rPr>
-      </w:pPr>
-      <w:r>
-        <w:rPr>
-          <w:b/>
-          <w:bCs/>
-        </w:rPr>
-        <w:t>HSV</w:t>
-      </w:r>
-      <w:r>
-        <w:rPr>
-          <w:b/>
-          <w:bCs/>
-        </w:rPr>
-        <w:t>:</w:t>
-      </w:r>
-    </w:p>
-    <w:p>
-      <w:pPr>
-        <w:spacing w:before="80" w:after="80" w:line="320" w:lineRule="auto"/>
-        <w:jc w:val="both"/>
-      </w:pPr>
-      <w:r>
-        <w:rPr>
-          <w:b/>
-          <w:bCs/>
-        </w:rPr>
-        <w:t xml:space="preserve"> </w:t>
-      </w:r>
-      <w:r>
-        <w:t xml:space="preserve">El espacio HSV reorganiza la información cromática en tres componentes: </w:t>
-      </w:r>
-      <w:proofErr w:type="spellStart"/>
-      <w:r>
-        <w:t>Hue</w:t>
-      </w:r>
-      <w:proofErr w:type="spellEnd"/>
-      <w:r>
-        <w:t xml:space="preserve"> (tono), </w:t>
-      </w:r>
-      <w:proofErr w:type="spellStart"/>
-      <w:r>
-        <w:t>Saturation</w:t>
-      </w:r>
-      <w:proofErr w:type="spellEnd"/>
-      <w:r>
-        <w:t xml:space="preserve"> (saturación) y </w:t>
-      </w:r>
-      <w:proofErr w:type="spellStart"/>
-      <w:r>
-        <w:t>Value</w:t>
-      </w:r>
-      <w:proofErr w:type="spellEnd"/>
-      <w:r>
-        <w:t xml:space="preserve"> (brillo):</w:t>
-      </w:r>
-    </w:p>
-    <w:p>
-      <w:pPr>
-        <w:spacing w:before="80" w:after="80" w:line="320" w:lineRule="auto"/>
-        <w:jc w:val="center"/>
-      </w:pPr>
-      <w:r>
-        <w:t>(H, S, V)</w:t>
-      </w:r>
-    </w:p>
-    <w:p>
-      <w:pPr>
-        <w:spacing w:before="80" w:after="80" w:line="320" w:lineRule="auto"/>
-        <w:jc w:val="both"/>
-      </w:pPr>
-      <w:r>
-        <w:t>La conversión desde RGB hacia HSV permite separar la información de color de la de luminosidad, lo que facilita operaciones de segmentación, clasificación de colores y análisis perceptual. Esto resulta especialmente útil en la corrección cromática para daltonismo, ya que permite modificar el tono sin alterar el brillo percibido.</w:t>
-      </w:r>
-    </w:p>
-    <w:p>
-      <w:pPr>
-        <w:spacing w:before="80" w:after="80" w:line="320" w:lineRule="auto"/>
-        <w:jc w:val="both"/>
-      </w:pPr>
-      <w:r>
-        <w:t>La conversión de RGB a HSV sigue las fórmulas estándar (Foley et al., 1990), donde el tono H se calcula en función del canal dominante y las diferencias entre canales.</w:t>
-      </w:r>
-    </w:p>
-    <w:p/>
     <w:p>
       <w:pPr>
         <w:pStyle w:val="Ttulo1"/>
@@ -880,8 +803,892 @@
         <w:jc w:val="both"/>
       </w:pPr>
       <w:r>
+        <w:t>Deficiencia asociada al canal azul (conos S). Es la menos frecuente de las tres. Genera confusión entre tonos azules y amarillos, así como dificultades en la percepción de tonos fríos en general.</w:t>
+      </w:r>
+    </w:p>
+    <w:p/>
+    <w:p>
+      <w:pPr>
+        <w:pStyle w:val="Ttulo2"/>
+        <w:spacing w:before="240" w:after="120"/>
+      </w:pPr>
+      <w:r>
+        <w:rPr>
+          <w:b/>
+          <w:bCs/>
+          <w:color w:val="2E5496"/>
+        </w:rPr>
+        <w:t>4.4 Teoría de Etapas: Por Qué el Cerebro No Procesa los Conos por Separado</w:t>
+      </w:r>
+    </w:p>
+    <w:p>
+      <w:pPr>
+        <w:spacing w:before="80" w:after="80" w:line="320" w:lineRule="auto"/>
+        <w:jc w:val="both"/>
+      </w:pPr>
+      <w:r>
+        <w:t>Una comprensión superficial del daltonismo podría sugerir que la alteración de un cono afecta únicamente el canal de color correspondiente. Sin embargo, la fisiología del sistema visual humano revela un mecanismo significativamente más complejo que tiene consecuencias directas sobre la modelización matemática del fenómeno.</w:t>
+      </w:r>
+    </w:p>
+    <w:p>
+      <w:pPr>
+        <w:pStyle w:val="Ttulo3"/>
+        <w:spacing w:before="180" w:after="80"/>
+      </w:pPr>
+      <w:r>
+        <w:rPr>
+          <w:b/>
+          <w:bCs/>
+        </w:rPr>
+        <w:t>4.4.1 Etapa 1: La Retina (Teoría Tricromática)</w:t>
+      </w:r>
+    </w:p>
+    <w:p>
+      <w:pPr>
+        <w:spacing w:before="80" w:after="80" w:line="320" w:lineRule="auto"/>
+        <w:jc w:val="both"/>
+      </w:pPr>
+      <w:r>
+        <w:t xml:space="preserve">La teoría tricromática de Young-Helmholtz (siglo XIX) describe correctamente el primer nivel del sistema visual: los tres tipos de conos (L, M, S) absorben la luz y generan señales eléctricas proporcionales a su sensibilidad espectral. Cada cono produce un valor escalar entre 0 y 1 que representa el nivel de activación ante un estímulo luminoso dado. Smith y </w:t>
+      </w:r>
+      <w:proofErr w:type="spellStart"/>
+      <w:r>
+        <w:t>Pokorny</w:t>
+      </w:r>
+      <w:proofErr w:type="spellEnd"/>
+      <w:r>
+        <w:t xml:space="preserve"> (1975) midieron con precisión estas curvas de sensibilidad espectral en retinas </w:t>
+      </w:r>
+      <w:r>
         <w:lastRenderedPageBreak/>
-        <w:t>Deficiencia asociada al canal azul (conos S). Es la menos frecuente de las tres. Genera confusión entre tonos azules y amarillos, así como dificultades en la percepción de tonos fríos en general.</w:t>
+        <w:t>humanas reales, estableciendo los valores de referencia utilizados en los modelos computacionales actuales.</w:t>
+      </w:r>
+    </w:p>
+    <w:p>
+      <w:pPr>
+        <w:spacing w:before="120" w:after="80"/>
+        <w:jc w:val="center"/>
+      </w:pPr>
+      <w:r>
+        <w:rPr>
+          <w:noProof/>
+        </w:rPr>
+        <w:drawing>
+          <wp:inline distT="0" distB="0" distL="0" distR="0" wp14:anchorId="50B7D5E7" wp14:editId="351A6B45">
+            <wp:extent cx="5731510" cy="3244215"/>
+            <wp:effectExtent l="0" t="0" r="2540" b="0"/>
+            <wp:docPr id="1467303558" name="Imagen 6" descr="imagen"/>
+            <wp:cNvGraphicFramePr>
+              <a:graphicFrameLocks xmlns:a="http://schemas.openxmlformats.org/drawingml/2006/main" noChangeAspect="1"/>
+            </wp:cNvGraphicFramePr>
+            <a:graphic xmlns:a="http://schemas.openxmlformats.org/drawingml/2006/main">
+              <a:graphicData uri="http://schemas.openxmlformats.org/drawingml/2006/picture">
+                <pic:pic xmlns:pic="http://schemas.openxmlformats.org/drawingml/2006/picture">
+                  <pic:nvPicPr>
+                    <pic:cNvPr id="0" name="Picture 3" descr="imagen"/>
+                    <pic:cNvPicPr>
+                      <a:picLocks noChangeAspect="1" noChangeArrowheads="1"/>
+                    </pic:cNvPicPr>
+                  </pic:nvPicPr>
+                  <pic:blipFill>
+                    <a:blip r:embed="rId5">
+                      <a:extLst>
+                        <a:ext uri="{28A0092B-C50C-407E-A947-70E740481C1C}">
+                          <a14:useLocalDpi xmlns:a14="http://schemas.microsoft.com/office/drawing/2010/main" val="0"/>
+                        </a:ext>
+                      </a:extLst>
+                    </a:blip>
+                    <a:srcRect/>
+                    <a:stretch>
+                      <a:fillRect/>
+                    </a:stretch>
+                  </pic:blipFill>
+                  <pic:spPr bwMode="auto">
+                    <a:xfrm>
+                      <a:off x="0" y="0"/>
+                      <a:ext cx="5731510" cy="3244215"/>
+                    </a:xfrm>
+                    <a:prstGeom prst="rect">
+                      <a:avLst/>
+                    </a:prstGeom>
+                    <a:noFill/>
+                    <a:ln>
+                      <a:noFill/>
+                    </a:ln>
+                  </pic:spPr>
+                </pic:pic>
+              </a:graphicData>
+            </a:graphic>
+          </wp:inline>
+        </w:drawing>
+      </w:r>
+    </w:p>
+    <w:p>
+      <w:pPr>
+        <w:spacing w:after="240"/>
+        <w:jc w:val="center"/>
+      </w:pPr>
+      <w:r>
+        <w:rPr>
+          <w:i/>
+          <w:iCs/>
+          <w:color w:val="555555"/>
+          <w:sz w:val="20"/>
+          <w:szCs w:val="20"/>
+        </w:rPr>
+        <w:t>Figura 1. Sensibilidad relativa de los conos L, M y S</w:t>
+      </w:r>
+    </w:p>
+    <w:p>
+      <w:pPr>
+        <w:spacing w:before="80" w:after="80" w:line="320" w:lineRule="auto"/>
+        <w:jc w:val="both"/>
+      </w:pPr>
+    </w:p>
+    <w:p>
+      <w:pPr>
+        <w:pStyle w:val="Ttulo3"/>
+        <w:spacing w:before="180" w:after="80"/>
+      </w:pPr>
+      <w:r>
+        <w:rPr>
+          <w:b/>
+          <w:bCs/>
+        </w:rPr>
+        <w:t>4.4.2 Etapa 2: El Nervio Óptico (Teoría de Colores Opuestos)</w:t>
+      </w:r>
+    </w:p>
+    <w:p>
+      <w:pPr>
+        <w:spacing w:before="80" w:after="80" w:line="320" w:lineRule="auto"/>
+        <w:jc w:val="both"/>
+      </w:pPr>
+      <w:r>
+        <w:t xml:space="preserve">El descubrimiento fundamental de </w:t>
+      </w:r>
+      <w:proofErr w:type="spellStart"/>
+      <w:r>
+        <w:t>Ingling</w:t>
+      </w:r>
+      <w:proofErr w:type="spellEnd"/>
+      <w:r>
+        <w:t xml:space="preserve"> y </w:t>
+      </w:r>
+      <w:proofErr w:type="spellStart"/>
+      <w:r>
+        <w:t>Tsou</w:t>
+      </w:r>
+      <w:proofErr w:type="spellEnd"/>
+      <w:r>
+        <w:t xml:space="preserve"> (1977), obtenido mediante mediciones electrofisiológicas directas en el nervio óptico humano, demostró que las señales de los conos no viajan al cerebro de forma independiente. En cambio, la retina realiza una combinación lineal de las señales L, M y S antes de transmitirlas, generando tres canales de salida cualitativamente diferentes:</w:t>
+      </w:r>
+    </w:p>
+    <w:p>
+      <w:pPr>
+        <w:spacing w:before="60" w:after="60" w:line="320" w:lineRule="auto"/>
+        <w:jc w:val="both"/>
+      </w:pPr>
+      <w:r>
+        <w:rPr>
+          <w:b/>
+        </w:rPr>
+        <w:t>Canal de luminancia (</w:t>
+      </w:r>
+      <w:proofErr w:type="spellStart"/>
+      <w:r>
+        <w:rPr>
+          <w:b/>
+        </w:rPr>
+        <w:t>Vλ</w:t>
+      </w:r>
+      <w:proofErr w:type="spellEnd"/>
+      <w:r>
+        <w:rPr>
+          <w:b/>
+        </w:rPr>
+        <w:t>):</w:t>
+      </w:r>
+      <w:r>
+        <w:t xml:space="preserve"> combina L y M para codificar el brillo percibido. El cono S no contribuye a este canal, lo que explica por qué las luces azules parecen más oscuras a igual energía.</w:t>
+      </w:r>
+    </w:p>
+    <w:p>
+      <w:pPr>
+        <w:spacing w:before="60" w:after="60" w:line="320" w:lineRule="auto"/>
+        <w:jc w:val="both"/>
+      </w:pPr>
+      <w:r>
+        <w:rPr>
+          <w:b/>
+        </w:rPr>
+        <w:t>Canal rojo-verde (r−g):</w:t>
+      </w:r>
+      <w:r>
+        <w:t xml:space="preserve"> codifica la diferencia entre L y M con coeficientes amplificados (1.200 y −1.600), reflejando la alta sensibilidad evolutiva del sistema visual a este contraste.</w:t>
+      </w:r>
+    </w:p>
+    <w:p>
+      <w:pPr>
+        <w:spacing w:before="60" w:after="60" w:line="320" w:lineRule="auto"/>
+        <w:jc w:val="both"/>
+      </w:pPr>
+      <w:r>
+        <w:rPr>
+          <w:b/>
+        </w:rPr>
+        <w:t>Canal amarillo-azul (y−b):</w:t>
+      </w:r>
+      <w:r>
+        <w:t xml:space="preserve"> codifica la oposición entre S y la combinación L+M. El signo negativo del coeficiente de S (−0.700) genera la oposición perceptual entre el azul y el amarillo.</w:t>
+      </w:r>
+    </w:p>
+    <w:p>
+      <w:pPr>
+        <w:spacing w:before="80" w:after="80" w:line="320" w:lineRule="auto"/>
+        <w:jc w:val="both"/>
+      </w:pPr>
+      <w:r>
+        <w:t xml:space="preserve">Esta combinación se formaliza mediante la transformación matricial de </w:t>
+      </w:r>
+      <w:proofErr w:type="spellStart"/>
+      <w:r>
+        <w:t>Ingling</w:t>
+      </w:r>
+      <w:proofErr w:type="spellEnd"/>
+      <w:r>
+        <w:t xml:space="preserve"> y </w:t>
+      </w:r>
+      <w:proofErr w:type="spellStart"/>
+      <w:r>
+        <w:t>Tsou</w:t>
+      </w:r>
+      <w:proofErr w:type="spellEnd"/>
+      <w:r>
+        <w:t xml:space="preserve">, en su forma </w:t>
+      </w:r>
+      <w:proofErr w:type="spellStart"/>
+      <w:r>
+        <w:t>supraumbralmenos</w:t>
+      </w:r>
+      <w:proofErr w:type="spellEnd"/>
+      <w:r>
+        <w:t>:</w:t>
+      </w:r>
+    </w:p>
+    <w:p>
+      <w:pPr>
+        <w:spacing w:before="80" w:after="80" w:line="320" w:lineRule="auto"/>
+        <w:jc w:val="center"/>
+      </w:pPr>
+      <w:r>
+        <w:rPr>
+          <w:noProof/>
+        </w:rPr>
+        <w:drawing>
+          <wp:inline distT="0" distB="0" distL="0" distR="0" wp14:anchorId="52C954AE" wp14:editId="57FABC63">
+            <wp:extent cx="3406140" cy="730885"/>
+            <wp:effectExtent l="0" t="0" r="3810" b="0"/>
+            <wp:docPr id="560278852" name="Imagen 1"/>
+            <wp:cNvGraphicFramePr>
+              <a:graphicFrameLocks xmlns:a="http://schemas.openxmlformats.org/drawingml/2006/main" noChangeAspect="1"/>
+            </wp:cNvGraphicFramePr>
+            <a:graphic xmlns:a="http://schemas.openxmlformats.org/drawingml/2006/main">
+              <a:graphicData uri="http://schemas.openxmlformats.org/drawingml/2006/picture">
+                <pic:pic xmlns:pic="http://schemas.openxmlformats.org/drawingml/2006/picture">
+                  <pic:nvPicPr>
+                    <pic:cNvPr id="0" name="Picture 1"/>
+                    <pic:cNvPicPr>
+                      <a:picLocks noChangeAspect="1" noChangeArrowheads="1"/>
+                    </pic:cNvPicPr>
+                  </pic:nvPicPr>
+                  <pic:blipFill>
+                    <a:blip r:embed="rId6">
+                      <a:extLst>
+                        <a:ext uri="{28A0092B-C50C-407E-A947-70E740481C1C}">
+                          <a14:useLocalDpi xmlns:a14="http://schemas.microsoft.com/office/drawing/2010/main" val="0"/>
+                        </a:ext>
+                      </a:extLst>
+                    </a:blip>
+                    <a:srcRect/>
+                    <a:stretch>
+                      <a:fillRect/>
+                    </a:stretch>
+                  </pic:blipFill>
+                  <pic:spPr bwMode="auto">
+                    <a:xfrm>
+                      <a:off x="0" y="0"/>
+                      <a:ext cx="3406140" cy="730885"/>
+                    </a:xfrm>
+                    <a:prstGeom prst="rect">
+                      <a:avLst/>
+                    </a:prstGeom>
+                    <a:noFill/>
+                    <a:ln>
+                      <a:noFill/>
+                    </a:ln>
+                  </pic:spPr>
+                </pic:pic>
+              </a:graphicData>
+            </a:graphic>
+          </wp:inline>
+        </w:drawing>
+      </w:r>
+    </w:p>
+    <w:p>
+      <w:pPr>
+        <w:spacing w:before="80" w:after="80" w:line="320" w:lineRule="auto"/>
+        <w:jc w:val="both"/>
+      </w:pPr>
+      <w:r>
+        <w:lastRenderedPageBreak/>
+        <w:t xml:space="preserve">Los coeficientes de esta matriz no son arbitrarios: derivan directamente de las mediciones electrofisiológicas de </w:t>
+      </w:r>
+      <w:proofErr w:type="spellStart"/>
+      <w:r>
+        <w:t>Ingling</w:t>
+      </w:r>
+      <w:proofErr w:type="spellEnd"/>
+      <w:r>
+        <w:t xml:space="preserve"> y </w:t>
+      </w:r>
+      <w:proofErr w:type="spellStart"/>
+      <w:r>
+        <w:t>Tsou</w:t>
+      </w:r>
+      <w:proofErr w:type="spellEnd"/>
+      <w:r>
+        <w:t xml:space="preserve"> (1977), combinadas con las curvas espectrales de Smith y </w:t>
+      </w:r>
+      <w:proofErr w:type="spellStart"/>
+      <w:r>
+        <w:t>Pokorny</w:t>
+      </w:r>
+      <w:proofErr w:type="spellEnd"/>
+      <w:r>
+        <w:t xml:space="preserve"> (1975). Cada valor representa la contribución biológicamente medida de cada cono a cada canal de percepción.</w:t>
+      </w:r>
+    </w:p>
+    <w:p>
+      <w:pPr>
+        <w:spacing w:before="80" w:after="80" w:line="320" w:lineRule="auto"/>
+        <w:jc w:val="center"/>
+      </w:pPr>
+      <w:r>
+        <w:rPr>
+          <w:noProof/>
+        </w:rPr>
+        <w:drawing>
+          <wp:anchor distT="0" distB="0" distL="114300" distR="114300" simplePos="0" relativeHeight="251660288" behindDoc="0" locked="0" layoutInCell="1" allowOverlap="1" wp14:anchorId="76A4F653" wp14:editId="06B4B255">
+            <wp:simplePos x="0" y="0"/>
+            <wp:positionH relativeFrom="column">
+              <wp:posOffset>2743201</wp:posOffset>
+            </wp:positionH>
+            <wp:positionV relativeFrom="paragraph">
+              <wp:posOffset>26671</wp:posOffset>
+            </wp:positionV>
+            <wp:extent cx="3413328" cy="2559050"/>
+            <wp:effectExtent l="0" t="0" r="0" b="0"/>
+            <wp:wrapNone/>
+            <wp:docPr id="2138836190" name="Imagen 4"/>
+            <wp:cNvGraphicFramePr>
+              <a:graphicFrameLocks xmlns:a="http://schemas.openxmlformats.org/drawingml/2006/main" noChangeAspect="1"/>
+            </wp:cNvGraphicFramePr>
+            <a:graphic xmlns:a="http://schemas.openxmlformats.org/drawingml/2006/main">
+              <a:graphicData uri="http://schemas.openxmlformats.org/drawingml/2006/picture">
+                <pic:pic xmlns:pic="http://schemas.openxmlformats.org/drawingml/2006/picture">
+                  <pic:nvPicPr>
+                    <pic:cNvPr id="0" name="Picture 1"/>
+                    <pic:cNvPicPr>
+                      <a:picLocks noChangeAspect="1" noChangeArrowheads="1"/>
+                    </pic:cNvPicPr>
+                  </pic:nvPicPr>
+                  <pic:blipFill>
+                    <a:blip r:embed="rId7">
+                      <a:extLst>
+                        <a:ext uri="{28A0092B-C50C-407E-A947-70E740481C1C}">
+                          <a14:useLocalDpi xmlns:a14="http://schemas.microsoft.com/office/drawing/2010/main" val="0"/>
+                        </a:ext>
+                      </a:extLst>
+                    </a:blip>
+                    <a:srcRect/>
+                    <a:stretch>
+                      <a:fillRect/>
+                    </a:stretch>
+                  </pic:blipFill>
+                  <pic:spPr bwMode="auto">
+                    <a:xfrm>
+                      <a:off x="0" y="0"/>
+                      <a:ext cx="3420456" cy="2564394"/>
+                    </a:xfrm>
+                    <a:prstGeom prst="rect">
+                      <a:avLst/>
+                    </a:prstGeom>
+                    <a:noFill/>
+                    <a:ln>
+                      <a:noFill/>
+                    </a:ln>
+                  </pic:spPr>
+                </pic:pic>
+              </a:graphicData>
+            </a:graphic>
+            <wp14:sizeRelH relativeFrom="page">
+              <wp14:pctWidth>0</wp14:pctWidth>
+            </wp14:sizeRelH>
+            <wp14:sizeRelV relativeFrom="page">
+              <wp14:pctHeight>0</wp14:pctHeight>
+            </wp14:sizeRelV>
+          </wp:anchor>
+        </w:drawing>
+      </w:r>
+      <w:r>
+        <w:rPr>
+          <w:noProof/>
+        </w:rPr>
+        <w:drawing>
+          <wp:anchor distT="0" distB="0" distL="114300" distR="114300" simplePos="0" relativeHeight="251659264" behindDoc="0" locked="0" layoutInCell="1" allowOverlap="1" wp14:anchorId="53C596CE" wp14:editId="71EEC986">
+            <wp:simplePos x="0" y="0"/>
+            <wp:positionH relativeFrom="column">
+              <wp:posOffset>-136525</wp:posOffset>
+            </wp:positionH>
+            <wp:positionV relativeFrom="paragraph">
+              <wp:posOffset>20320</wp:posOffset>
+            </wp:positionV>
+            <wp:extent cx="2828290" cy="2535555"/>
+            <wp:effectExtent l="0" t="0" r="0" b="0"/>
+            <wp:wrapNone/>
+            <wp:docPr id="1626778839" name="Imagen 3"/>
+            <wp:cNvGraphicFramePr>
+              <a:graphicFrameLocks xmlns:a="http://schemas.openxmlformats.org/drawingml/2006/main" noChangeAspect="1"/>
+            </wp:cNvGraphicFramePr>
+            <a:graphic xmlns:a="http://schemas.openxmlformats.org/drawingml/2006/main">
+              <a:graphicData uri="http://schemas.openxmlformats.org/drawingml/2006/picture">
+                <pic:pic xmlns:pic="http://schemas.openxmlformats.org/drawingml/2006/picture">
+                  <pic:nvPicPr>
+                    <pic:cNvPr id="0" name="Picture 4"/>
+                    <pic:cNvPicPr>
+                      <a:picLocks noChangeAspect="1" noChangeArrowheads="1"/>
+                    </pic:cNvPicPr>
+                  </pic:nvPicPr>
+                  <pic:blipFill>
+                    <a:blip r:embed="rId8">
+                      <a:extLst>
+                        <a:ext uri="{28A0092B-C50C-407E-A947-70E740481C1C}">
+                          <a14:useLocalDpi xmlns:a14="http://schemas.microsoft.com/office/drawing/2010/main" val="0"/>
+                        </a:ext>
+                      </a:extLst>
+                    </a:blip>
+                    <a:srcRect/>
+                    <a:stretch>
+                      <a:fillRect/>
+                    </a:stretch>
+                  </pic:blipFill>
+                  <pic:spPr bwMode="auto">
+                    <a:xfrm>
+                      <a:off x="0" y="0"/>
+                      <a:ext cx="2828290" cy="2535555"/>
+                    </a:xfrm>
+                    <a:prstGeom prst="rect">
+                      <a:avLst/>
+                    </a:prstGeom>
+                    <a:noFill/>
+                    <a:ln>
+                      <a:noFill/>
+                    </a:ln>
+                  </pic:spPr>
+                </pic:pic>
+              </a:graphicData>
+            </a:graphic>
+            <wp14:sizeRelH relativeFrom="page">
+              <wp14:pctWidth>0</wp14:pctWidth>
+            </wp14:sizeRelH>
+            <wp14:sizeRelV relativeFrom="page">
+              <wp14:pctHeight>0</wp14:pctHeight>
+            </wp14:sizeRelV>
+          </wp:anchor>
+        </w:drawing>
+      </w:r>
+    </w:p>
+    <w:p>
+      <w:pPr>
+        <w:spacing w:before="80" w:after="80" w:line="320" w:lineRule="auto"/>
+        <w:jc w:val="center"/>
+      </w:pPr>
+    </w:p>
+    <w:p>
+      <w:pPr>
+        <w:spacing w:before="80" w:after="80" w:line="320" w:lineRule="auto"/>
+        <w:jc w:val="center"/>
+      </w:pPr>
+    </w:p>
+    <w:p>
+      <w:pPr>
+        <w:spacing w:before="80" w:after="80" w:line="320" w:lineRule="auto"/>
+        <w:jc w:val="center"/>
+      </w:pPr>
+    </w:p>
+    <w:p>
+      <w:pPr>
+        <w:spacing w:before="80" w:after="80" w:line="320" w:lineRule="auto"/>
+        <w:jc w:val="center"/>
+      </w:pPr>
+    </w:p>
+    <w:p>
+      <w:pPr>
+        <w:spacing w:before="80" w:after="80" w:line="320" w:lineRule="auto"/>
+        <w:jc w:val="center"/>
+      </w:pPr>
+    </w:p>
+    <w:p>
+      <w:pPr>
+        <w:spacing w:before="80" w:after="80" w:line="320" w:lineRule="auto"/>
+        <w:jc w:val="center"/>
+      </w:pPr>
+    </w:p>
+    <w:p>
+      <w:pPr>
+        <w:spacing w:before="80" w:after="80" w:line="320" w:lineRule="auto"/>
+        <w:jc w:val="center"/>
+      </w:pPr>
+    </w:p>
+    <w:p>
+      <w:pPr>
+        <w:spacing w:before="80" w:after="80" w:line="320" w:lineRule="auto"/>
+        <w:jc w:val="center"/>
+      </w:pPr>
+    </w:p>
+    <w:p>
+      <w:pPr>
+        <w:spacing w:before="80" w:after="80" w:line="320" w:lineRule="auto"/>
+        <w:jc w:val="center"/>
+      </w:pPr>
+    </w:p>
+    <w:p>
+      <w:pPr>
+        <w:spacing w:before="80" w:after="80" w:line="320" w:lineRule="auto"/>
+        <w:jc w:val="center"/>
+      </w:pPr>
+    </w:p>
+    <w:p>
+      <w:pPr>
+        <w:spacing w:before="80" w:after="80" w:line="320" w:lineRule="auto"/>
+        <w:jc w:val="center"/>
+      </w:pPr>
+    </w:p>
+    <w:p>
+      <w:pPr>
+        <w:spacing w:before="80" w:after="80" w:line="320" w:lineRule="auto"/>
+        <w:jc w:val="center"/>
+      </w:pPr>
+    </w:p>
+    <w:p>
+      <w:pPr>
+        <w:spacing w:before="80" w:after="80" w:line="320" w:lineRule="auto"/>
+        <w:jc w:val="center"/>
+      </w:pPr>
+    </w:p>
+    <w:p>
+      <w:pPr>
+        <w:spacing w:before="80" w:after="80" w:line="320" w:lineRule="auto"/>
+        <w:jc w:val="center"/>
+      </w:pPr>
+    </w:p>
+    <w:p>
+      <w:pPr>
+        <w:spacing w:before="80" w:after="80" w:line="320" w:lineRule="auto"/>
+        <w:jc w:val="center"/>
+      </w:pPr>
+    </w:p>
+    <w:p>
+      <w:pPr>
+        <w:spacing w:before="80" w:after="80" w:line="320" w:lineRule="auto"/>
+        <w:jc w:val="center"/>
+      </w:pPr>
+    </w:p>
+    <w:p>
+      <w:pPr>
+        <w:spacing w:before="80" w:after="80" w:line="320" w:lineRule="auto"/>
+        <w:jc w:val="center"/>
+      </w:pPr>
+    </w:p>
+    <w:p>
+      <w:pPr>
+        <w:spacing w:before="80" w:after="80" w:line="320" w:lineRule="auto"/>
+        <w:jc w:val="center"/>
+      </w:pPr>
+    </w:p>
+    <w:p>
+      <w:pPr>
+        <w:spacing w:before="80" w:after="80" w:line="320" w:lineRule="auto"/>
+        <w:jc w:val="center"/>
+      </w:pPr>
+    </w:p>
+    <w:p>
+      <w:pPr>
+        <w:spacing w:before="80" w:after="80" w:line="320" w:lineRule="auto"/>
+        <w:jc w:val="center"/>
+      </w:pPr>
+    </w:p>
+    <w:p>
+      <w:pPr>
+        <w:spacing w:before="80" w:after="80" w:line="320" w:lineRule="auto"/>
+        <w:jc w:val="center"/>
+      </w:pPr>
+    </w:p>
+    <w:p>
+      <w:pPr>
+        <w:spacing w:before="80" w:after="80" w:line="320" w:lineRule="auto"/>
+        <w:jc w:val="center"/>
+      </w:pPr>
+    </w:p>
+    <w:p>
+      <w:pPr>
+        <w:spacing w:before="80" w:after="80" w:line="320" w:lineRule="auto"/>
+        <w:jc w:val="center"/>
+      </w:pPr>
+    </w:p>
+    <w:p>
+      <w:pPr>
+        <w:spacing w:before="80" w:after="80" w:line="320" w:lineRule="auto"/>
+        <w:jc w:val="center"/>
+      </w:pPr>
+    </w:p>
+    <w:p>
+      <w:pPr>
+        <w:spacing w:before="80" w:after="80" w:line="320" w:lineRule="auto"/>
+        <w:jc w:val="center"/>
+      </w:pPr>
+    </w:p>
+    <w:p>
+      <w:pPr>
+        <w:spacing w:before="80" w:after="80" w:line="320" w:lineRule="auto"/>
+        <w:jc w:val="center"/>
+      </w:pPr>
+    </w:p>
+    <w:p>
+      <w:pPr>
+        <w:spacing w:before="80" w:after="80" w:line="320" w:lineRule="auto"/>
+        <w:jc w:val="center"/>
+      </w:pPr>
+    </w:p>
+    <w:p>
+      <w:pPr>
+        <w:spacing w:before="80" w:after="80" w:line="320" w:lineRule="auto"/>
+        <w:jc w:val="center"/>
+      </w:pPr>
+    </w:p>
+    <w:p>
+      <w:pPr>
+        <w:spacing w:before="80" w:after="80" w:line="320" w:lineRule="auto"/>
+        <w:jc w:val="center"/>
+      </w:pPr>
+    </w:p>
+    <w:p>
+      <w:pPr>
+        <w:pStyle w:val="Ttulo3"/>
+        <w:spacing w:before="180" w:after="80"/>
+      </w:pPr>
+      <w:r>
+        <w:rPr>
+          <w:b/>
+          <w:bCs/>
+        </w:rPr>
+        <w:lastRenderedPageBreak/>
+        <w:t>4.4.3 Consecuencias para la Modelización del Daltonismo</w:t>
+      </w:r>
+    </w:p>
+    <w:p>
+      <w:pPr>
+        <w:spacing w:before="80" w:after="80" w:line="320" w:lineRule="auto"/>
+        <w:jc w:val="both"/>
+      </w:pPr>
+      <w:r>
+        <w:t xml:space="preserve">La estructura de dos etapas tiene una implicación crítica para la simulación computacional: si un cono se altera, la perturbación no queda confinada a un único canal de salida, sino que se propaga a todos los canales que dependen de ese cono a través de la matriz. Por ejemplo, en la </w:t>
+      </w:r>
+      <w:proofErr w:type="spellStart"/>
+      <w:r>
+        <w:t>deuteranopía</w:t>
+      </w:r>
+      <w:proofErr w:type="spellEnd"/>
+      <w:r>
+        <w:t xml:space="preserve"> (ausencia del cono M), tanto el canal de luminancia </w:t>
+      </w:r>
+      <w:proofErr w:type="spellStart"/>
+      <w:r>
+        <w:t>Vλ</w:t>
+      </w:r>
+      <w:proofErr w:type="spellEnd"/>
+      <w:r>
+        <w:t xml:space="preserve"> como el canal rojo-verde r−g resultan afectados simultáneamente, ya que ambos incluyen coeficientes no nulos para M en la </w:t>
+      </w:r>
+      <w:proofErr w:type="spellStart"/>
+      <w:r>
+        <w:t>Ec</w:t>
+      </w:r>
+      <w:proofErr w:type="spellEnd"/>
+      <w:r>
+        <w:t>. IT.</w:t>
+      </w:r>
+    </w:p>
+    <w:p>
+      <w:pPr>
+        <w:spacing w:before="80" w:after="80" w:line="320" w:lineRule="auto"/>
+        <w:jc w:val="both"/>
+      </w:pPr>
+      <w:r>
+        <w:t>Esta es precisamente la limitación del enfoque simplificado utilizado por Yang et al. (2008), que opera únicamente a nivel de fotorreceptores sin considerar la etapa de procesamiento neuronal. Dicho enfoque genera imágenes simuladas con tonos verdes, rojos y púrpuras que los individuos daltónicos en realidad no perciben, ya que ignora la distorsión que la alteración del cono introduce en los canales de color opuesto.</w:t>
+      </w:r>
+    </w:p>
+    <w:p>
+      <w:pPr>
+        <w:spacing w:before="80" w:after="80" w:line="320" w:lineRule="auto"/>
+        <w:jc w:val="both"/>
+      </w:pPr>
+      <w:r>
+        <w:t xml:space="preserve">El modelo de Machado, Oliveira y </w:t>
+      </w:r>
+      <w:proofErr w:type="spellStart"/>
+      <w:r>
+        <w:t>Fernandes</w:t>
+      </w:r>
+      <w:proofErr w:type="spellEnd"/>
+      <w:r>
+        <w:t xml:space="preserve"> (2009), adoptado en este proyecto, resuelve esta limitación integrando ambas etapas en una transformación unificada. La simulación se formula como:</w:t>
+      </w:r>
+    </w:p>
+    <w:p>
+      <w:pPr>
+        <w:spacing w:before="80" w:after="80" w:line="320" w:lineRule="auto"/>
+        <w:jc w:val="center"/>
+      </w:pPr>
+      <w:r>
+        <w:rPr>
+          <w:noProof/>
+        </w:rPr>
+        <w:drawing>
+          <wp:inline distT="0" distB="0" distL="0" distR="0" wp14:anchorId="6A13BF0C" wp14:editId="1CC6130C">
+            <wp:extent cx="3345180" cy="785495"/>
+            <wp:effectExtent l="0" t="0" r="7620" b="0"/>
+            <wp:docPr id="706116436" name="Imagen 5"/>
+            <wp:cNvGraphicFramePr>
+              <a:graphicFrameLocks xmlns:a="http://schemas.openxmlformats.org/drawingml/2006/main" noChangeAspect="1"/>
+            </wp:cNvGraphicFramePr>
+            <a:graphic xmlns:a="http://schemas.openxmlformats.org/drawingml/2006/main">
+              <a:graphicData uri="http://schemas.openxmlformats.org/drawingml/2006/picture">
+                <pic:pic xmlns:pic="http://schemas.openxmlformats.org/drawingml/2006/picture">
+                  <pic:nvPicPr>
+                    <pic:cNvPr id="0" name="Picture 5"/>
+                    <pic:cNvPicPr>
+                      <a:picLocks noChangeAspect="1" noChangeArrowheads="1"/>
+                    </pic:cNvPicPr>
+                  </pic:nvPicPr>
+                  <pic:blipFill>
+                    <a:blip r:embed="rId9">
+                      <a:extLst>
+                        <a:ext uri="{28A0092B-C50C-407E-A947-70E740481C1C}">
+                          <a14:useLocalDpi xmlns:a14="http://schemas.microsoft.com/office/drawing/2010/main" val="0"/>
+                        </a:ext>
+                      </a:extLst>
+                    </a:blip>
+                    <a:srcRect/>
+                    <a:stretch>
+                      <a:fillRect/>
+                    </a:stretch>
+                  </pic:blipFill>
+                  <pic:spPr bwMode="auto">
+                    <a:xfrm>
+                      <a:off x="0" y="0"/>
+                      <a:ext cx="3345180" cy="785495"/>
+                    </a:xfrm>
+                    <a:prstGeom prst="rect">
+                      <a:avLst/>
+                    </a:prstGeom>
+                    <a:noFill/>
+                    <a:ln>
+                      <a:noFill/>
+                    </a:ln>
+                  </pic:spPr>
+                </pic:pic>
+              </a:graphicData>
+            </a:graphic>
+          </wp:inline>
+        </w:drawing>
+      </w:r>
+    </w:p>
+    <w:p>
+      <w:pPr>
+        <w:pStyle w:val="NormalWeb"/>
+      </w:pPr>
+      <w:r>
+        <w:rPr>
+          <w:noProof/>
+        </w:rPr>
+        <w:drawing>
+          <wp:inline distT="0" distB="0" distL="0" distR="0" wp14:anchorId="0542CEDE" wp14:editId="50D00EEE">
+            <wp:extent cx="5731510" cy="3224530"/>
+            <wp:effectExtent l="0" t="0" r="2540" b="0"/>
+            <wp:docPr id="312740636" name="Imagen 6"/>
+            <wp:cNvGraphicFramePr>
+              <a:graphicFrameLocks xmlns:a="http://schemas.openxmlformats.org/drawingml/2006/main" noChangeAspect="1"/>
+            </wp:cNvGraphicFramePr>
+            <a:graphic xmlns:a="http://schemas.openxmlformats.org/drawingml/2006/main">
+              <a:graphicData uri="http://schemas.openxmlformats.org/drawingml/2006/picture">
+                <pic:pic xmlns:pic="http://schemas.openxmlformats.org/drawingml/2006/picture">
+                  <pic:nvPicPr>
+                    <pic:cNvPr id="0" name="Picture 6"/>
+                    <pic:cNvPicPr>
+                      <a:picLocks noChangeAspect="1" noChangeArrowheads="1"/>
+                    </pic:cNvPicPr>
+                  </pic:nvPicPr>
+                  <pic:blipFill>
+                    <a:blip r:embed="rId10">
+                      <a:extLst>
+                        <a:ext uri="{28A0092B-C50C-407E-A947-70E740481C1C}">
+                          <a14:useLocalDpi xmlns:a14="http://schemas.microsoft.com/office/drawing/2010/main" val="0"/>
+                        </a:ext>
+                      </a:extLst>
+                    </a:blip>
+                    <a:srcRect/>
+                    <a:stretch>
+                      <a:fillRect/>
+                    </a:stretch>
+                  </pic:blipFill>
+                  <pic:spPr bwMode="auto">
+                    <a:xfrm>
+                      <a:off x="0" y="0"/>
+                      <a:ext cx="5731510" cy="3224530"/>
+                    </a:xfrm>
+                    <a:prstGeom prst="rect">
+                      <a:avLst/>
+                    </a:prstGeom>
+                    <a:noFill/>
+                    <a:ln>
+                      <a:noFill/>
+                    </a:ln>
+                  </pic:spPr>
+                </pic:pic>
+              </a:graphicData>
+            </a:graphic>
+          </wp:inline>
+        </w:drawing>
+      </w:r>
+    </w:p>
+    <w:p>
+      <w:pPr>
+        <w:spacing w:before="100" w:after="100" w:line="320" w:lineRule="auto"/>
+        <w:jc w:val="center"/>
+      </w:pPr>
+    </w:p>
+    <w:p>
+      <w:pPr>
+        <w:spacing w:before="80" w:after="80" w:line="320" w:lineRule="auto"/>
+        <w:jc w:val="both"/>
+      </w:pPr>
+      <w:r>
+        <w:t xml:space="preserve">Donde Γ_DVC es la matriz de transformación al espacio de colores opuestos construida a partir de los conos alterados del tipo de daltonismo específico, y Γ⁻¹_normal es la inversa de la matriz equivalente para visión normal. El resultado es una única multiplicación matricial por </w:t>
+      </w:r>
+      <w:r>
+        <w:lastRenderedPageBreak/>
+        <w:t>píxel, computacionalmente eficiente y ejecutable en tiempo real sobre GPU, que respeta la cadena fisiológica completa desde la retina hasta la percepción cerebral.</w:t>
       </w:r>
     </w:p>
     <w:p/>
@@ -1128,7 +1935,7 @@
                         <w:rPr>
                           <w:rFonts w:ascii="Cambria Math" w:hAnsi="Cambria Math"/>
                         </w:rPr>
-                        <m:t>1</m:t>
+                        <m:t>'</m:t>
                       </m:r>
                     </m:sup>
                   </m:sSup>
@@ -1156,7 +1963,7 @@
                         <w:rPr>
                           <w:rFonts w:ascii="Cambria Math" w:hAnsi="Cambria Math"/>
                         </w:rPr>
-                        <m:t>1</m:t>
+                        <m:t>'</m:t>
                       </m:r>
                     </m:sup>
                   </m:sSup>
@@ -1300,13 +2107,18 @@
         <w:jc w:val="both"/>
       </w:pPr>
       <w:r>
-        <w:t xml:space="preserve">A </w:t>
-      </w:r>
-      <w:r>
-        <w:t>continuación,</w:t>
-      </w:r>
-      <w:r>
-        <w:t xml:space="preserve"> se presentan las matrices estándar para los tres tipos contemplados, basadas en el modelo de Machado, Oliveira y </w:t>
+        <w:t>A continuación, se presentan las matrices estándar para los tres tipos contemplados</w:t>
+      </w:r>
+      <w:r>
+        <w:t xml:space="preserve"> y </w:t>
+      </w:r>
+      <w:proofErr w:type="gramStart"/>
+      <w:r>
+        <w:t>su severidades</w:t>
+      </w:r>
+      <w:proofErr w:type="gramEnd"/>
+      <w:r>
+        <w:t xml:space="preserve">, basadas en el modelo de Machado, Oliveira y </w:t>
       </w:r>
       <w:proofErr w:type="spellStart"/>
       <w:r>
@@ -1317,352 +2129,103 @@
         <w:t xml:space="preserve"> (2009):</w:t>
       </w:r>
     </w:p>
+    <w:p>
+      <w:r>
+        <w:rPr>
+          <w:noProof/>
+        </w:rPr>
+        <w:drawing>
+          <wp:anchor distT="0" distB="0" distL="114300" distR="114300" simplePos="0" relativeHeight="251661312" behindDoc="0" locked="0" layoutInCell="1" allowOverlap="1" wp14:anchorId="732436D3" wp14:editId="3807F523">
+            <wp:simplePos x="0" y="0"/>
+            <wp:positionH relativeFrom="margin">
+              <wp:posOffset>333375</wp:posOffset>
+            </wp:positionH>
+            <wp:positionV relativeFrom="paragraph">
+              <wp:posOffset>31750</wp:posOffset>
+            </wp:positionV>
+            <wp:extent cx="4692650" cy="4749839"/>
+            <wp:effectExtent l="0" t="0" r="0" b="0"/>
+            <wp:wrapNone/>
+            <wp:docPr id="1811772867" name="Imagen 5"/>
+            <wp:cNvGraphicFramePr>
+              <a:graphicFrameLocks xmlns:a="http://schemas.openxmlformats.org/drawingml/2006/main" noChangeAspect="1"/>
+            </wp:cNvGraphicFramePr>
+            <a:graphic xmlns:a="http://schemas.openxmlformats.org/drawingml/2006/main">
+              <a:graphicData uri="http://schemas.openxmlformats.org/drawingml/2006/picture">
+                <pic:pic xmlns:pic="http://schemas.openxmlformats.org/drawingml/2006/picture">
+                  <pic:nvPicPr>
+                    <pic:cNvPr id="0" name="Picture 2"/>
+                    <pic:cNvPicPr>
+                      <a:picLocks noChangeAspect="1" noChangeArrowheads="1"/>
+                    </pic:cNvPicPr>
+                  </pic:nvPicPr>
+                  <pic:blipFill>
+                    <a:blip r:embed="rId11" cstate="print">
+                      <a:extLst>
+                        <a:ext uri="{28A0092B-C50C-407E-A947-70E740481C1C}">
+                          <a14:useLocalDpi xmlns:a14="http://schemas.microsoft.com/office/drawing/2010/main" val="0"/>
+                        </a:ext>
+                      </a:extLst>
+                    </a:blip>
+                    <a:srcRect/>
+                    <a:stretch>
+                      <a:fillRect/>
+                    </a:stretch>
+                  </pic:blipFill>
+                  <pic:spPr bwMode="auto">
+                    <a:xfrm>
+                      <a:off x="0" y="0"/>
+                      <a:ext cx="4692650" cy="4749839"/>
+                    </a:xfrm>
+                    <a:prstGeom prst="rect">
+                      <a:avLst/>
+                    </a:prstGeom>
+                    <a:noFill/>
+                    <a:ln>
+                      <a:noFill/>
+                    </a:ln>
+                  </pic:spPr>
+                </pic:pic>
+              </a:graphicData>
+            </a:graphic>
+            <wp14:sizeRelH relativeFrom="page">
+              <wp14:pctWidth>0</wp14:pctWidth>
+            </wp14:sizeRelH>
+            <wp14:sizeRelV relativeFrom="page">
+              <wp14:pctHeight>0</wp14:pctHeight>
+            </wp14:sizeRelV>
+          </wp:anchor>
+        </w:drawing>
+      </w:r>
+    </w:p>
     <w:p/>
-    <w:p>
-      <w:pPr>
-        <w:spacing w:before="80" w:after="80" w:line="320" w:lineRule="auto"/>
-        <w:jc w:val="both"/>
-      </w:pPr>
-      <w:proofErr w:type="spellStart"/>
-      <w:r>
-        <w:rPr>
-          <w:b/>
-          <w:bCs/>
-        </w:rPr>
-        <w:t>Protanopia</w:t>
-      </w:r>
-      <w:proofErr w:type="spellEnd"/>
-      <w:r>
-        <w:rPr>
-          <w:b/>
-          <w:bCs/>
-        </w:rPr>
-        <w:t xml:space="preserve"> (</w:t>
-      </w:r>
-      <w:proofErr w:type="spellStart"/>
-      <w:r>
-        <w:rPr>
-          <w:b/>
-          <w:bCs/>
-        </w:rPr>
-        <w:t>Mprot</w:t>
-      </w:r>
-      <w:proofErr w:type="spellEnd"/>
-      <w:r>
-        <w:rPr>
-          <w:b/>
-          <w:bCs/>
-        </w:rPr>
-        <w:t>):</w:t>
-      </w:r>
-    </w:p>
-    <w:p>
-      <w:pPr>
-        <w:spacing w:before="120" w:after="120"/>
-        <w:jc w:val="center"/>
-      </w:pPr>
-      <w:r>
-        <w:rPr>
-          <w:rFonts w:ascii="Courier New" w:eastAsia="Courier New" w:hAnsi="Courier New" w:cs="Courier New"/>
-        </w:rPr>
-        <w:t xml:space="preserve">[ </w:t>
-      </w:r>
-      <w:proofErr w:type="gramStart"/>
-      <w:r>
-        <w:rPr>
-          <w:rFonts w:ascii="Courier New" w:eastAsia="Courier New" w:hAnsi="Courier New" w:cs="Courier New"/>
-        </w:rPr>
-        <w:t>0.152  1.053</w:t>
-      </w:r>
-      <w:proofErr w:type="gramEnd"/>
-      <w:r>
-        <w:rPr>
-          <w:rFonts w:ascii="Courier New" w:eastAsia="Courier New" w:hAnsi="Courier New" w:cs="Courier New"/>
-        </w:rPr>
-        <w:t xml:space="preserve">  -0.205 ]</w:t>
-      </w:r>
-    </w:p>
-    <w:p>
-      <w:pPr>
-        <w:spacing w:before="120" w:after="120"/>
-        <w:jc w:val="center"/>
-      </w:pPr>
-      <w:r>
-        <w:rPr>
-          <w:rFonts w:ascii="Courier New" w:eastAsia="Courier New" w:hAnsi="Courier New" w:cs="Courier New"/>
-        </w:rPr>
-        <w:t xml:space="preserve">[ </w:t>
-      </w:r>
-      <w:proofErr w:type="gramStart"/>
-      <w:r>
-        <w:rPr>
-          <w:rFonts w:ascii="Courier New" w:eastAsia="Courier New" w:hAnsi="Courier New" w:cs="Courier New"/>
-        </w:rPr>
-        <w:t>0.115  0.786</w:t>
-      </w:r>
-      <w:proofErr w:type="gramEnd"/>
-      <w:r>
-        <w:rPr>
-          <w:rFonts w:ascii="Courier New" w:eastAsia="Courier New" w:hAnsi="Courier New" w:cs="Courier New"/>
-        </w:rPr>
-        <w:t xml:space="preserve">   0.099 ]</w:t>
-      </w:r>
-    </w:p>
-    <w:p>
-      <w:pPr>
-        <w:spacing w:before="120" w:after="120"/>
-        <w:jc w:val="center"/>
-      </w:pPr>
-      <w:r>
-        <w:rPr>
-          <w:rFonts w:ascii="Courier New" w:eastAsia="Courier New" w:hAnsi="Courier New" w:cs="Courier New"/>
-        </w:rPr>
-        <w:t xml:space="preserve">[-0.004 -0.048   </w:t>
-      </w:r>
-      <w:proofErr w:type="gramStart"/>
-      <w:r>
-        <w:rPr>
-          <w:rFonts w:ascii="Courier New" w:eastAsia="Courier New" w:hAnsi="Courier New" w:cs="Courier New"/>
-        </w:rPr>
-        <w:t>1.052 ]</w:t>
-      </w:r>
-      <w:proofErr w:type="gramEnd"/>
-    </w:p>
     <w:p/>
-    <w:p>
-      <w:pPr>
-        <w:spacing w:before="80" w:after="80" w:line="320" w:lineRule="auto"/>
-        <w:jc w:val="both"/>
-      </w:pPr>
-      <w:proofErr w:type="spellStart"/>
-      <w:r>
-        <w:rPr>
-          <w:b/>
-          <w:bCs/>
-        </w:rPr>
-        <w:t>Deuteranopia</w:t>
-      </w:r>
-      <w:proofErr w:type="spellEnd"/>
-      <w:r>
-        <w:rPr>
-          <w:b/>
-          <w:bCs/>
-        </w:rPr>
-        <w:t xml:space="preserve"> (</w:t>
-      </w:r>
-      <w:proofErr w:type="spellStart"/>
-      <w:r>
-        <w:rPr>
-          <w:b/>
-          <w:bCs/>
-        </w:rPr>
-        <w:t>Mdeut</w:t>
-      </w:r>
-      <w:proofErr w:type="spellEnd"/>
-      <w:r>
-        <w:rPr>
-          <w:b/>
-          <w:bCs/>
-        </w:rPr>
-        <w:t>):</w:t>
-      </w:r>
-    </w:p>
-    <w:p>
-      <w:pPr>
-        <w:spacing w:before="120" w:after="120"/>
-        <w:jc w:val="center"/>
-      </w:pPr>
-      <w:r>
-        <w:rPr>
-          <w:rFonts w:ascii="Courier New" w:eastAsia="Courier New" w:hAnsi="Courier New" w:cs="Courier New"/>
-        </w:rPr>
-        <w:t xml:space="preserve">[ </w:t>
-      </w:r>
-      <w:proofErr w:type="gramStart"/>
-      <w:r>
-        <w:rPr>
-          <w:rFonts w:ascii="Courier New" w:eastAsia="Courier New" w:hAnsi="Courier New" w:cs="Courier New"/>
-        </w:rPr>
-        <w:t>0.367  0.861</w:t>
-      </w:r>
-      <w:proofErr w:type="gramEnd"/>
-      <w:r>
-        <w:rPr>
-          <w:rFonts w:ascii="Courier New" w:eastAsia="Courier New" w:hAnsi="Courier New" w:cs="Courier New"/>
-        </w:rPr>
-        <w:t xml:space="preserve">  -0.228 ]</w:t>
-      </w:r>
-    </w:p>
-    <w:p>
-      <w:pPr>
-        <w:spacing w:before="120" w:after="120"/>
-        <w:jc w:val="center"/>
-      </w:pPr>
-      <w:r>
-        <w:rPr>
-          <w:rFonts w:ascii="Courier New" w:eastAsia="Courier New" w:hAnsi="Courier New" w:cs="Courier New"/>
-        </w:rPr>
-        <w:t xml:space="preserve">[ </w:t>
-      </w:r>
-      <w:proofErr w:type="gramStart"/>
-      <w:r>
-        <w:rPr>
-          <w:rFonts w:ascii="Courier New" w:eastAsia="Courier New" w:hAnsi="Courier New" w:cs="Courier New"/>
-        </w:rPr>
-        <w:t>0.280  0.673</w:t>
-      </w:r>
-      <w:proofErr w:type="gramEnd"/>
-      <w:r>
-        <w:rPr>
-          <w:rFonts w:ascii="Courier New" w:eastAsia="Courier New" w:hAnsi="Courier New" w:cs="Courier New"/>
-        </w:rPr>
-        <w:t xml:space="preserve">   0.047 ]</w:t>
-      </w:r>
-    </w:p>
-    <w:p>
-      <w:pPr>
-        <w:spacing w:before="120" w:after="120"/>
-        <w:jc w:val="center"/>
-      </w:pPr>
-      <w:r>
-        <w:rPr>
-          <w:rFonts w:ascii="Courier New" w:eastAsia="Courier New" w:hAnsi="Courier New" w:cs="Courier New"/>
-        </w:rPr>
-        <w:t>[-0.</w:t>
-      </w:r>
-      <w:proofErr w:type="gramStart"/>
-      <w:r>
-        <w:rPr>
-          <w:rFonts w:ascii="Courier New" w:eastAsia="Courier New" w:hAnsi="Courier New" w:cs="Courier New"/>
-        </w:rPr>
-        <w:t>012  0.043</w:t>
-      </w:r>
-      <w:proofErr w:type="gramEnd"/>
-      <w:r>
-        <w:rPr>
-          <w:rFonts w:ascii="Courier New" w:eastAsia="Courier New" w:hAnsi="Courier New" w:cs="Courier New"/>
-        </w:rPr>
-        <w:t xml:space="preserve">   0.969 ]</w:t>
-      </w:r>
-    </w:p>
     <w:p/>
-    <w:p>
-      <w:pPr>
-        <w:spacing w:before="80" w:after="80" w:line="320" w:lineRule="auto"/>
-        <w:jc w:val="both"/>
-      </w:pPr>
-      <w:proofErr w:type="spellStart"/>
-      <w:r>
-        <w:rPr>
-          <w:b/>
-          <w:bCs/>
-        </w:rPr>
-        <w:lastRenderedPageBreak/>
-        <w:t>Tritanopia</w:t>
-      </w:r>
-      <w:proofErr w:type="spellEnd"/>
-      <w:r>
-        <w:rPr>
-          <w:b/>
-          <w:bCs/>
-        </w:rPr>
-        <w:t xml:space="preserve"> (</w:t>
-      </w:r>
-      <w:proofErr w:type="spellStart"/>
-      <w:r>
-        <w:rPr>
-          <w:b/>
-          <w:bCs/>
-        </w:rPr>
-        <w:t>Mtrit</w:t>
-      </w:r>
-      <w:proofErr w:type="spellEnd"/>
-      <w:r>
-        <w:rPr>
-          <w:b/>
-          <w:bCs/>
-        </w:rPr>
-        <w:t>):</w:t>
-      </w:r>
-    </w:p>
-    <w:p>
-      <w:pPr>
-        <w:spacing w:before="120" w:after="120"/>
-        <w:jc w:val="center"/>
-      </w:pPr>
-      <w:r>
-        <w:rPr>
-          <w:rFonts w:ascii="Courier New" w:eastAsia="Courier New" w:hAnsi="Courier New" w:cs="Courier New"/>
-        </w:rPr>
-        <w:t>[ 1.256 -0.</w:t>
-      </w:r>
-      <w:proofErr w:type="gramStart"/>
-      <w:r>
-        <w:rPr>
-          <w:rFonts w:ascii="Courier New" w:eastAsia="Courier New" w:hAnsi="Courier New" w:cs="Courier New"/>
-        </w:rPr>
-        <w:t>077  -</w:t>
-      </w:r>
-      <w:proofErr w:type="gramEnd"/>
-      <w:r>
-        <w:rPr>
-          <w:rFonts w:ascii="Courier New" w:eastAsia="Courier New" w:hAnsi="Courier New" w:cs="Courier New"/>
-        </w:rPr>
-        <w:t>0.179 ]</w:t>
-      </w:r>
-    </w:p>
-    <w:p>
-      <w:pPr>
-        <w:spacing w:before="120" w:after="120"/>
-        <w:jc w:val="center"/>
-      </w:pPr>
-      <w:r>
-        <w:rPr>
-          <w:rFonts w:ascii="Courier New" w:eastAsia="Courier New" w:hAnsi="Courier New" w:cs="Courier New"/>
-        </w:rPr>
-        <w:t>[-0.</w:t>
-      </w:r>
-      <w:proofErr w:type="gramStart"/>
-      <w:r>
-        <w:rPr>
-          <w:rFonts w:ascii="Courier New" w:eastAsia="Courier New" w:hAnsi="Courier New" w:cs="Courier New"/>
-        </w:rPr>
-        <w:t>078  0.931</w:t>
-      </w:r>
-      <w:proofErr w:type="gramEnd"/>
-      <w:r>
-        <w:rPr>
-          <w:rFonts w:ascii="Courier New" w:eastAsia="Courier New" w:hAnsi="Courier New" w:cs="Courier New"/>
-        </w:rPr>
-        <w:t xml:space="preserve">   0.148 ]</w:t>
-      </w:r>
-    </w:p>
-    <w:p>
-      <w:pPr>
-        <w:spacing w:before="120" w:after="120"/>
-        <w:jc w:val="center"/>
-      </w:pPr>
-      <w:r>
-        <w:rPr>
-          <w:rFonts w:ascii="Courier New" w:eastAsia="Courier New" w:hAnsi="Courier New" w:cs="Courier New"/>
-        </w:rPr>
-        <w:t xml:space="preserve">[ </w:t>
-      </w:r>
-      <w:proofErr w:type="gramStart"/>
-      <w:r>
-        <w:rPr>
-          <w:rFonts w:ascii="Courier New" w:eastAsia="Courier New" w:hAnsi="Courier New" w:cs="Courier New"/>
-        </w:rPr>
-        <w:t>0.005  0.692</w:t>
-      </w:r>
-      <w:proofErr w:type="gramEnd"/>
-      <w:r>
-        <w:rPr>
-          <w:rFonts w:ascii="Courier New" w:eastAsia="Courier New" w:hAnsi="Courier New" w:cs="Courier New"/>
-        </w:rPr>
-        <w:t xml:space="preserve">   0.303 ]</w:t>
-      </w:r>
-    </w:p>
+    <w:p/>
+    <w:p/>
+    <w:p/>
+    <w:p/>
+    <w:p/>
+    <w:p/>
+    <w:p/>
+    <w:p/>
+    <w:p/>
+    <w:p/>
+    <w:p/>
+    <w:p/>
+    <w:p/>
+    <w:p/>
+    <w:p/>
+    <w:p/>
+    <w:p/>
+    <w:p/>
+    <w:p/>
+    <w:p/>
+    <w:p/>
+    <w:p/>
+    <w:p/>
+    <w:p/>
+    <w:p/>
     <w:p/>
     <w:p>
       <w:pPr>
@@ -1947,241 +2510,118 @@
           <w:sz w:val="20"/>
           <w:szCs w:val="20"/>
         </w:rPr>
-        <w:t>│   ├── simulador.py        # Módulo de simulación</w:t>
-      </w:r>
-    </w:p>
-    <w:p>
+        <w:t xml:space="preserve">│   ├── </w:t>
+      </w:r>
       <w:r>
         <w:rPr>
           <w:rFonts w:ascii="Courier New" w:eastAsia="Courier New" w:hAnsi="Courier New" w:cs="Courier New"/>
           <w:sz w:val="20"/>
           <w:szCs w:val="20"/>
         </w:rPr>
-        <w:t>│   ├── corrector.py        # Módulo de corrección</w:t>
-      </w:r>
-    </w:p>
-    <w:p>
+        <w:t>_init_</w:t>
+      </w:r>
       <w:r>
         <w:rPr>
           <w:rFonts w:ascii="Courier New" w:eastAsia="Courier New" w:hAnsi="Courier New" w:cs="Courier New"/>
           <w:sz w:val="20"/>
           <w:szCs w:val="20"/>
         </w:rPr>
-        <w:t xml:space="preserve">│   ├── protanopia.py       # Lógica de </w:t>
-      </w:r>
-      <w:proofErr w:type="spellStart"/>
+        <w:t xml:space="preserve">.py        </w:t>
+      </w:r>
+    </w:p>
+    <w:p>
       <w:r>
         <w:rPr>
           <w:rFonts w:ascii="Courier New" w:eastAsia="Courier New" w:hAnsi="Courier New" w:cs="Courier New"/>
           <w:sz w:val="20"/>
           <w:szCs w:val="20"/>
         </w:rPr>
-        <w:t>protanopia</w:t>
-      </w:r>
-      <w:proofErr w:type="spellEnd"/>
-    </w:p>
-    <w:p>
+        <w:t xml:space="preserve">│   ├── </w:t>
+      </w:r>
       <w:r>
         <w:rPr>
           <w:rFonts w:ascii="Courier New" w:eastAsia="Courier New" w:hAnsi="Courier New" w:cs="Courier New"/>
           <w:sz w:val="20"/>
           <w:szCs w:val="20"/>
         </w:rPr>
-        <w:t xml:space="preserve">│   ├── deuteranopia.py     # Lógica de </w:t>
-      </w:r>
-      <w:proofErr w:type="spellStart"/>
+        <w:t>combinado</w:t>
+      </w:r>
       <w:r>
         <w:rPr>
           <w:rFonts w:ascii="Courier New" w:eastAsia="Courier New" w:hAnsi="Courier New" w:cs="Courier New"/>
           <w:sz w:val="20"/>
           <w:szCs w:val="20"/>
         </w:rPr>
-        <w:t>deuteranopia</w:t>
-      </w:r>
-      <w:proofErr w:type="spellEnd"/>
-    </w:p>
-    <w:p>
-      <w:pPr>
+        <w:t xml:space="preserve">.py        </w:t>
+      </w:r>
+    </w:p>
+    <w:p>
+      <w:r>
         <w:rPr>
           <w:rFonts w:ascii="Courier New" w:eastAsia="Courier New" w:hAnsi="Courier New" w:cs="Courier New"/>
           <w:sz w:val="20"/>
           <w:szCs w:val="20"/>
         </w:rPr>
-      </w:pPr>
+        <w:t xml:space="preserve">│   ├── </w:t>
+      </w:r>
       <w:r>
         <w:rPr>
           <w:rFonts w:ascii="Courier New" w:eastAsia="Courier New" w:hAnsi="Courier New" w:cs="Courier New"/>
           <w:sz w:val="20"/>
           <w:szCs w:val="20"/>
         </w:rPr>
-        <w:t xml:space="preserve">│   └── tritanopia.py      # Lógica de </w:t>
-      </w:r>
-      <w:proofErr w:type="spellStart"/>
+        <w:t>daltonismo</w:t>
+      </w:r>
       <w:r>
         <w:rPr>
           <w:rFonts w:ascii="Courier New" w:eastAsia="Courier New" w:hAnsi="Courier New" w:cs="Courier New"/>
           <w:sz w:val="20"/>
           <w:szCs w:val="20"/>
         </w:rPr>
-        <w:t>tritanopia</w:t>
-      </w:r>
-      <w:proofErr w:type="spellEnd"/>
-    </w:p>
-    <w:p>
-      <w:r>
+        <w:t xml:space="preserve">.py       </w:t>
+      </w:r>
+    </w:p>
+    <w:p>
+      <w:pPr>
         <w:rPr>
           <w:rFonts w:ascii="Courier New" w:eastAsia="Courier New" w:hAnsi="Courier New" w:cs="Courier New"/>
           <w:sz w:val="20"/>
           <w:szCs w:val="20"/>
         </w:rPr>
-        <w:t xml:space="preserve">├── </w:t>
-      </w:r>
-      <w:proofErr w:type="spellStart"/>
+      </w:pPr>
       <w:r>
         <w:rPr>
           <w:rFonts w:ascii="Courier New" w:eastAsia="Courier New" w:hAnsi="Courier New" w:cs="Courier New"/>
           <w:sz w:val="20"/>
           <w:szCs w:val="20"/>
         </w:rPr>
-        <w:t>ia</w:t>
-      </w:r>
-      <w:proofErr w:type="spellEnd"/>
+        <w:t xml:space="preserve">├── main.py                </w:t>
+      </w:r>
+    </w:p>
+    <w:p>
+      <w:pPr>
+        <w:rPr>
+          <w:rFonts w:ascii="Courier New" w:hAnsi="Courier New" w:cs="Courier New"/>
+          <w:sz w:val="20"/>
+          <w:szCs w:val="20"/>
+        </w:rPr>
+      </w:pPr>
+      <w:r>
+        <w:rPr>
+          <w:rFonts w:ascii="Courier New" w:hAnsi="Courier New" w:cs="Courier New"/>
+          <w:sz w:val="20"/>
+          <w:szCs w:val="20"/>
+        </w:rPr>
+        <w:t>├── requirements.txt</w:t>
+      </w:r>
+    </w:p>
+    <w:p>
       <w:r>
         <w:rPr>
           <w:rFonts w:ascii="Courier New" w:eastAsia="Courier New" w:hAnsi="Courier New" w:cs="Courier New"/>
           <w:sz w:val="20"/>
           <w:szCs w:val="20"/>
         </w:rPr>
-        <w:t>/</w:t>
-      </w:r>
-      <w:r>
-        <w:rPr>
-          <w:rFonts w:ascii="Courier New" w:eastAsia="Courier New" w:hAnsi="Courier New" w:cs="Courier New"/>
-          <w:sz w:val="20"/>
-          <w:szCs w:val="20"/>
-        </w:rPr>
-        <w:tab/>
-      </w:r>
-      <w:r>
-        <w:rPr>
-          <w:rFonts w:ascii="Courier New" w:eastAsia="Courier New" w:hAnsi="Courier New" w:cs="Courier New"/>
-          <w:sz w:val="20"/>
-          <w:szCs w:val="20"/>
-        </w:rPr>
-        <w:tab/>
-      </w:r>
-      <w:r>
-        <w:rPr>
-          <w:rFonts w:ascii="Courier New" w:eastAsia="Courier New" w:hAnsi="Courier New" w:cs="Courier New"/>
-          <w:sz w:val="20"/>
-          <w:szCs w:val="20"/>
-        </w:rPr>
-        <w:tab/>
-        <w:t xml:space="preserve">    # Inteligencia artificial a futuro</w:t>
-      </w:r>
-    </w:p>
-    <w:p>
-      <w:pPr>
-        <w:rPr>
-          <w:rFonts w:ascii="Courier New" w:eastAsia="Courier New" w:hAnsi="Courier New" w:cs="Courier New"/>
-          <w:sz w:val="20"/>
-          <w:szCs w:val="20"/>
-        </w:rPr>
-      </w:pPr>
-      <w:r>
-        <w:rPr>
-          <w:rFonts w:ascii="Courier New" w:eastAsia="Courier New" w:hAnsi="Courier New" w:cs="Courier New"/>
-          <w:sz w:val="20"/>
-          <w:szCs w:val="20"/>
-        </w:rPr>
-        <w:t>├── main.py                # Punto de entrada</w:t>
-      </w:r>
-    </w:p>
-    <w:p>
-      <w:pPr>
-        <w:rPr>
-          <w:rFonts w:ascii="Courier New" w:eastAsia="Courier New" w:hAnsi="Courier New" w:cs="Courier New"/>
-          <w:sz w:val="20"/>
-          <w:szCs w:val="20"/>
-        </w:rPr>
-      </w:pPr>
-      <w:r>
-        <w:rPr>
-          <w:rFonts w:ascii="Courier New" w:eastAsia="Courier New" w:hAnsi="Courier New" w:cs="Courier New"/>
-          <w:sz w:val="20"/>
-          <w:szCs w:val="20"/>
-        </w:rPr>
-        <w:t>├─</w:t>
-      </w:r>
-      <w:proofErr w:type="gramStart"/>
-      <w:r>
-        <w:rPr>
-          <w:rFonts w:ascii="Courier New" w:eastAsia="Courier New" w:hAnsi="Courier New" w:cs="Courier New"/>
-          <w:sz w:val="20"/>
-          <w:szCs w:val="20"/>
-        </w:rPr>
-        <w:t>─</w:t>
-      </w:r>
-      <w:r>
-        <w:rPr>
-          <w:rFonts w:ascii="Courier New" w:eastAsia="Courier New" w:hAnsi="Courier New" w:cs="Courier New"/>
-          <w:sz w:val="20"/>
-          <w:szCs w:val="20"/>
-        </w:rPr>
-        <w:t>.</w:t>
-      </w:r>
-      <w:proofErr w:type="spellStart"/>
-      <w:r>
-        <w:rPr>
-          <w:rFonts w:ascii="Courier New" w:eastAsia="Courier New" w:hAnsi="Courier New" w:cs="Courier New"/>
-          <w:sz w:val="20"/>
-          <w:szCs w:val="20"/>
-        </w:rPr>
-        <w:t>venv</w:t>
-      </w:r>
-      <w:proofErr w:type="spellEnd"/>
-      <w:proofErr w:type="gramEnd"/>
-      <w:r>
-        <w:rPr>
-          <w:rFonts w:ascii="Courier New" w:eastAsia="Courier New" w:hAnsi="Courier New" w:cs="Courier New"/>
-          <w:sz w:val="20"/>
-          <w:szCs w:val="20"/>
-        </w:rPr>
-        <w:t>/</w:t>
-      </w:r>
-      <w:r>
-        <w:rPr>
-          <w:rFonts w:ascii="Courier New" w:eastAsia="Courier New" w:hAnsi="Courier New" w:cs="Courier New"/>
-          <w:sz w:val="20"/>
-          <w:szCs w:val="20"/>
-        </w:rPr>
-        <w:t xml:space="preserve">                </w:t>
-      </w:r>
-    </w:p>
-    <w:p>
-      <w:pPr>
-        <w:rPr>
-          <w:rFonts w:ascii="Courier New" w:hAnsi="Courier New" w:cs="Courier New"/>
-          <w:sz w:val="20"/>
-          <w:szCs w:val="20"/>
-        </w:rPr>
-      </w:pPr>
-      <w:r>
-        <w:rPr>
-          <w:rFonts w:ascii="Courier New" w:hAnsi="Courier New" w:cs="Courier New"/>
-          <w:sz w:val="20"/>
-          <w:szCs w:val="20"/>
-        </w:rPr>
-        <w:t>├── requirements.txt</w:t>
-      </w:r>
-    </w:p>
-    <w:p>
-      <w:r>
-        <w:rPr>
-          <w:rFonts w:ascii="Courier New" w:eastAsia="Courier New" w:hAnsi="Courier New" w:cs="Courier New"/>
-          <w:sz w:val="20"/>
-          <w:szCs w:val="20"/>
-        </w:rPr>
         <w:t>└── README.md              # Documentación del proyecto</w:t>
       </w:r>
     </w:p>
@@ -2197,7 +2637,6 @@
           <w:bCs/>
           <w:color w:val="1F3864"/>
         </w:rPr>
-        <w:lastRenderedPageBreak/>
         <w:t>7. Flujo General del Sistema</w:t>
       </w:r>
     </w:p>
@@ -2356,7 +2795,7 @@
                     </pic:cNvPicPr>
                   </pic:nvPicPr>
                   <pic:blipFill>
-                    <a:blip r:embed="rId5"/>
+                    <a:blip r:embed="rId12"/>
                     <a:srcRect/>
                     <a:stretch>
                       <a:fillRect/>
@@ -2433,6 +2872,7 @@
       </w:pPr>
       <w:proofErr w:type="spellStart"/>
       <w:r>
+        <w:lastRenderedPageBreak/>
         <w:t>OpenCV</w:t>
       </w:r>
       <w:proofErr w:type="spellEnd"/>
@@ -2451,48 +2891,11 @@
       </w:pPr>
       <w:proofErr w:type="spellStart"/>
       <w:r>
-        <w:lastRenderedPageBreak/>
         <w:t>NumPy</w:t>
       </w:r>
       <w:proofErr w:type="spellEnd"/>
       <w:r>
         <w:t>: operaciones matriciales eficientes sobre arreglos multidimensionales.</w:t>
-      </w:r>
-    </w:p>
-    <w:p>
-      <w:pPr>
-        <w:pStyle w:val="Prrafodelista"/>
-        <w:numPr>
-          <w:ilvl w:val="0"/>
-          <w:numId w:val="2"/>
-        </w:numPr>
-        <w:spacing w:before="40" w:after="40"/>
-      </w:pPr>
-      <w:proofErr w:type="spellStart"/>
-      <w:r>
-        <w:t>Matplotlib</w:t>
-      </w:r>
-      <w:proofErr w:type="spellEnd"/>
-      <w:r>
-        <w:t>: visualización comparativa de imágenes originales, simuladas y corregidas.</w:t>
-      </w:r>
-    </w:p>
-    <w:p>
-      <w:pPr>
-        <w:pStyle w:val="Prrafodelista"/>
-        <w:numPr>
-          <w:ilvl w:val="0"/>
-          <w:numId w:val="2"/>
-        </w:numPr>
-        <w:spacing w:before="40" w:after="40"/>
-      </w:pPr>
-      <w:proofErr w:type="spellStart"/>
-      <w:r>
-        <w:t>scikit-image</w:t>
-      </w:r>
-      <w:proofErr w:type="spellEnd"/>
-      <w:r>
-        <w:t xml:space="preserve"> (opcional): utilidades complementarias para transformaciones de espacio de color y métricas de calidad de imagen.</w:t>
       </w:r>
     </w:p>
     <w:p/>
@@ -3903,6 +4306,22 @@
       <w:lang w:eastAsia="en-US"/>
     </w:rPr>
   </w:style>
+  <w:style w:type="paragraph" w:styleId="NormalWeb">
+    <w:name w:val="Normal (Web)"/>
+    <w:basedOn w:val="Normal"/>
+    <w:uiPriority w:val="99"/>
+    <w:semiHidden/>
+    <w:unhideWhenUsed/>
+    <w:rsid w:val="00C602D9"/>
+    <w:pPr>
+      <w:spacing w:before="100" w:beforeAutospacing="1" w:after="100" w:afterAutospacing="1"/>
+    </w:pPr>
+    <w:rPr>
+      <w:rFonts w:ascii="Times New Roman" w:eastAsia="Times New Roman" w:hAnsi="Times New Roman" w:cs="Times New Roman"/>
+      <w:sz w:val="24"/>
+      <w:szCs w:val="24"/>
+    </w:rPr>
+  </w:style>
 </w:styles>
 </file>
 

</xml_diff>